<commit_message>
Remove HF mirror labels from Milestone One draft v8.
Table 1 now names the Spotify and TMDB sources without the mirror note.

Co-authored-by: vals_plumber <ehui-lab@users.noreply.github.com>
</commit_message>
<xml_diff>
--- a/milestone1/dx699-milestone-one-draft-v8.docx
+++ b/milestone1/dx699-milestone-one-draft-v8.docx
@@ -395,7 +395,7 @@
               <w:rPr>
                 <w:sz w:val="24"/>
               </w:rPr>
-              <w:t>Ultimate Spotify Tracks DB (HF mirror)</w:t>
+              <w:t>Ultimate Spotify Tracks DB</w:t>
             </w:r>
           </w:p>
         </w:tc>
@@ -487,7 +487,7 @@
               <w:rPr>
                 <w:sz w:val="24"/>
               </w:rPr>
-              <w:t>The Movies Dataset (HF mirror)</w:t>
+              <w:t>The Movies Dataset</w:t>
             </w:r>
           </w:p>
         </w:tc>

</xml_diff>

<commit_message>
Move the Milestone One reflection summary into its own PDF.
The summary is no longer in the Word draft. The weekly journal stays in Appendix B.

Co-authored-by: vals_plumber <ehui-lab@users.noreply.github.com>
</commit_message>
<xml_diff>
--- a/milestone1/dx699-milestone-one-draft-v8.docx
+++ b/milestone1/dx699-milestone-one-draft-v8.docx
@@ -965,24 +965,6 @@
           <w:sz w:val="24"/>
         </w:rPr>
         <w:t>Are short sellers informed — does heavy shorting today predict underperformance next month? Directly testable against decades of academic debate, and personally the most market-relevant of my five datasets: it turns a regulatory disclosure into a trading question. Which matters more, the level of shorting or its change? That separates crowded shorts from fresh conviction.</w:t>
-      </w:r>
-    </w:p>
-    <w:p>
-      <w:r>
-        <w:rPr>
-          <w:b/>
-          <w:sz w:val="28"/>
-        </w:rPr>
-        <w:t>Reflection Summary</w:t>
-      </w:r>
-    </w:p>
-    <w:p>
-      <w:r/>
-      <w:r>
-        <w:rPr>
-          <w:sz w:val="24"/>
-        </w:rPr>
-        <w:t>The project began with six datasets across finance, e-commerce, real estate, sports, and healthcare; reviewing against my interests narrowed the industries to finance, environment, and entertainment, and four datasets were replaced. The most instructive step was extracting the SPY snapshot myself: plotting IV against strike reproduced the skew, and the Greeks against moneyness reproduced textbook delta, gamma, theta, and vega. With Kaggle unreachable from my machine, I worked from the Kaggle-published Spotify and TMDB datasets via local copies, and the fifth dataset — a FINRA short-interest panel joined with Yahoo Finance prices — was built from official regulatory filings. Key rubric learnings: double spacing, per-section structure with exact labels, genuine data-quality problems, one page of examples. The challenge: five datasets in five to eight double-spaced pages.</w:t>
       </w:r>
     </w:p>
     <w:p>

</xml_diff>

<commit_message>
Apply avoid-ai-writing cleanup to Milestone One draft v8.
Replace the 43 em dashes in the prose and headings with commas, colons,
periods, or parentheses, drop two hollow "genuine" intensifiers, and
change "learnings" to "lessons" in the reflection summary. Tables,
citations, figures, and all numbers are unchanged.

Co-authored-by: vals_plumber <ehui-lab@users.noreply.github.com>
</commit_message>
<xml_diff>
--- a/milestone1/dx699-milestone-one-draft-v8.docx
+++ b/milestone1/dx699-milestone-one-draft-v8.docx
@@ -643,7 +643,7 @@
     </w:p>
     <w:p>
       <w:r>
-        <w:t>A single-day cross-section of the SPY options chain on December 31, 2024 (spot 586.08), hand-extracted from a public historic U.S. equity options dataset: 9,646 contracts (4,823 calls, 4,823 puts) across 35 expirations and 362 strikes in 23 columns — contract identifiers (strike, call/put, expiration), market observables (bid, ask, last, sizes, volume, open interest), and model-derived outputs (implied volatility, delta, gamma, theta, vega, rho, moneyness, in-the-money flag). Mixed types: continuous numerics, categoricals, one binary flag. Cross-sectional, not a time series. The mix spans continuous market data, categorical contract terms, and model outputs — the paper's richest single-table feature set.</w:t>
+        <w:t>A single-day cross-section of the SPY options chain on December 31, 2024 (spot 586.08), hand-extracted from a public historic U.S. equity options dataset: 9,646 contracts (4,823 calls, 4,823 puts) across 35 expirations and 362 strikes in 23 columns: contract identifiers (strike, call/put, expiration), market observables (bid, ask, last, sizes, volume, open interest), and model-derived outputs (implied volatility, delta, gamma, theta, vega, rho, moneyness, in-the-money flag). Mixed types: continuous numerics, categoricals, one binary flag. Cross-sectional, not a time series. The mix spans continuous market data, categorical contract terms, and model outputs. It is the paper's richest single-table feature set.</w:t>
       </w:r>
     </w:p>
     <w:p>
@@ -657,7 +657,7 @@
     </w:p>
     <w:p>
       <w:r>
-        <w:t>Monthly registration records for China's passenger-car market, January 2018–April 2024, from China Passenger Car Association records: 38,806 model-month rows, 10 columns (year-month, make, brand, model, brand country, units sold, EV-versus-gasoline flag, body type, low/high price). Covers 139 brands and 1,345 brand-model combinations (136.9M units); 8,528 EV rows vs 30,278 gasoline, EV unit share 3.3% (2018) → 30.2% (2023). Framed cross-sectionally — a portrait of the electrification transition.</w:t>
+        <w:t>Monthly registration records for China's passenger-car market, January 2018–April 2024, from China Passenger Car Association records: 38,806 model-month rows, 10 columns (year-month, make, brand, model, brand country, units sold, EV-versus-gasoline flag, body type, low/high price). Covers 139 brands and 1,345 brand-model combinations (136.9M units); 8,528 EV rows vs 30,278 gasoline, EV unit share 3.3% (2018) → 30.2% (2023). Framed cross-sectionally, it is a portrait of the electrification transition.</w:t>
       </w:r>
     </w:p>
     <w:p>
@@ -712,7 +712,7 @@
         <w:rPr>
           <w:sz w:val="24"/>
         </w:rPr>
-        <w:t>Bi-monthly panel of 496 S&amp;P 500 constituents, March 2023–July 2026, joining FINRA’s official short-interest reports with Yahoo Finance prices: 16,071 stock-settlement rows × 21 columns — current and previous short shares, percent change in shorting, days-to-cover, short-to-volume ratio, plus close price, 1/3/6-month returns, 1-month volatility, high-low range, and volume trend — with two targets: next-month return and a beat-the-market binary (47% positive). Cross-sectional framing: does short sellers’ positioning predict next-period returns?</w:t>
+        <w:t>Bi-monthly panel of 496 S&amp;P 500 constituents, March 2023–July 2026, joining FINRA’s official short-interest reports with Yahoo Finance prices: 16,071 stock-settlement rows × 21 columns: current and previous short shares, percent change in shorting, days-to-cover, short-to-volume ratio, plus close price, 1/3/6-month returns, 1-month volatility, high-low range, and volume trend, with two targets: next-month return and a beat-the-market binary (47% positive). Cross-sectional framing: does short sellers’ positioning predict next-period returns?</w:t>
       </w:r>
     </w:p>
     <w:p>
@@ -735,7 +735,7 @@
     </w:p>
     <w:p>
       <w:r>
-        <w:t>No missing values. The problem is 625 zero-bid contracts (6.5%) — typically deep out-of-the-money long-dated puts quoted 0.00 bid against a wide ask with no volume. These dead quotes cannot be traded; any model trained on them learns from prices that do not exist, so they are discarded outright. A further ~200 ultra-wide-spread contracts (spreads above 50%) are filtered the same way, and implied volatility (range 0.015–4.034, extremes in illiquid names) is winsorized. Volume concentrates in zero-days-to-expiry and weeklies, so analysis is stratified by expiration; mid-prices replace last trades to avoid bid-ask bounce; the Greeks are model-derived features carrying model risk, not ground truth.</w:t>
+        <w:t>No missing values. The problem is 625 zero-bid contracts (6.5%), typically deep out-of-the-money long-dated puts quoted 0.00 bid against a wide ask with no volume. These dead quotes cannot be traded; any model trained on them learns from prices that do not exist, so they are discarded outright. A further ~200 ultra-wide-spread contracts (spreads above 50%) are filtered the same way, and implied volatility (range 0.015–4.034, extremes in illiquid names) is winsorized. Volume concentrates in zero-days-to-expiry and weeklies, so analysis is stratified by expiration; mid-prices replace last trades to avoid bid-ask bounce; the Greeks are model-derived features carrying model risk, not ground truth.</w:t>
       </w:r>
     </w:p>
     <w:p>
@@ -749,7 +749,7 @@
     </w:p>
     <w:p>
       <w:r>
-        <w:t>Thirty-four exact duplicate (model, year-month) rows are dropped. Body type is the literal string “NA” in 2,366 rows (6.1%) — kept as an “Unknown” category since missingness may correlate with low-volume models. In 6,127 rows (15.8%) the price is 0, dead data that is imputed within brand-model or excluded from price features. The manufacturer field is Chinese while brand is English, so modeling uses brand. February 2020 EV sales collapsed to 8,988 units (COVID lockdown) and the series ends April 2024 — structural breaks handled with regime dummies, never silent deletions.</w:t>
+        <w:t>Thirty-four exact duplicate (model, year-month) rows are dropped. Body type is the literal string “NA” in 2,366 rows (6.1%), kept as an “Unknown” category since missingness may correlate with low-volume models. In 6,127 rows (15.8%) the price is 0, dead data that is imputed within brand-model or excluded from price features. The manufacturer field is Chinese while brand is English, so modeling uses brand. February 2020 EV sales collapsed to 8,988 units (COVID lockdown) and the series ends April 2024. Structural breaks are handled with regime dummies, not deleted silently.</w:t>
       </w:r>
     </w:p>
     <w:p>
@@ -763,7 +763,7 @@
     </w:p>
     <w:p>
       <w:r>
-        <w:t>450 fully duplicated rows are removed. Subtler: 24,259 track ids repeat because the same song is listed under multiple genres — identical audio features with different labels, i.e., label noise. Fix: deduplicate to one row per track (most frequent genre) or frame genre as multi-label. The artificial 1,000-tracks-per-genre balance does not reflect listening shares, so prevalence conclusions must be reweighted.</w:t>
+        <w:t>450 fully duplicated rows are removed. Subtler: 24,259 track ids repeat because the same song is listed under multiple genres: identical audio features with different labels, i.e., label noise. Fix: deduplicate to one row per track (most frequent genre) or frame genre as multi-label. The artificial 1,000-tracks-per-genre balance does not reflect listening shares, so prevalence conclusions must be reweighted.</w:t>
       </w:r>
     </w:p>
     <w:p>
@@ -777,7 +777,7 @@
     </w:p>
     <w:p>
       <w:r>
-        <w:t>Seventeen duplicate rows dropped. Many budgets are 0 — missing data coded as zero, recoded as missing and imputed within genre-era cohorts or excluded. Genres, companies, countries, cast, and crew are nested JSON parsed into indicators/counts. Vote averages on few-vote films are shrunk toward the global mean.</w:t>
+        <w:t>Seventeen duplicate rows dropped. Many budgets are 0, missing data coded as zero, recoded as missing and imputed within genre-era cohorts or excluded. Genres, companies, countries, cast, and crew are nested JSON parsed into indicators/counts. Vote averages on few-vote films are shrunk toward the global mean.</w:t>
       </w:r>
     </w:p>
     <w:p>
@@ -796,7 +796,7 @@
         <w:rPr>
           <w:sz w:val="24"/>
         </w:rPr>
-        <w:t>No duplicate rows. Genuine missingness: the 6-month return feature is null in 1,447 rows (9%) — early settlement dates predate six months of Yahoo price history — handled by dropping those rows or restricting the feature set. Documented caveats: FINRA flags and republishes revised figures, so a rebuild from a later pull can differ slightly; and reports lag settlement by about a week, so the panel is a historical record, not a live trading signal.</w:t>
+        <w:t>No duplicate rows. The 6-month return feature is null in 1,447 rows (9%) (early settlement dates predate six months of Yahoo price history), handled by dropping those rows or restricting the feature set. Documented caveats: FINRA flags and republishes revised figures, so a rebuild from a later pull can differ slightly; and reports lag settlement by about a week, so the panel is a historical record, not a live trading signal.</w:t>
       </w:r>
     </w:p>
     <w:p>
@@ -819,7 +819,7 @@
     </w:p>
     <w:p>
       <w:r>
-        <w:t>Supervised regression: predict implied volatility from strike, moneyness, and time to expiry — each contract carries the quoted IV as target. The smile's nonlinearity suits tree ensembles or neural networks; a polynomial alternative tests the smile directly through its quadratic moneyness term. Classification: liquid vs illiquid from spread, volume, open interest, and distance from spot — a market-microstructure task modeling which contracts are actually tradable. Trees fit the regression because the smile is smooth but non-quadratic; the classifier fits because liquidity is a threshold phenomenon in spread and volume.</w:t>
+        <w:t>Supervised regression: predict implied volatility from strike, moneyness, and time to expiry, where each contract carries the quoted IV as target. The smile's nonlinearity suits tree ensembles or neural networks; a polynomial alternative tests the smile directly through its quadratic moneyness term. Classification: liquid vs illiquid from spread, volume, open interest, and distance from spot, a market-microstructure task modeling which contracts are actually tradable. Trees fit the regression because the smile is smooth but non-quadratic; the classifier fits because liquidity is a threshold phenomenon in spread and volume.</w:t>
       </w:r>
     </w:p>
     <w:p>
@@ -833,7 +833,7 @@
     </w:p>
     <w:p>
       <w:r>
-        <w:t>Classification: predict the EV-versus-gasoline flag from brand, brand country, body type, and price band — every model-month carries the label; tree ensembles suit the mixed features, and the exercise measures how predictable the transition was. Regression: predict monthly EV units from lagged sales and segment mix with expanding-window splits (no leakage); comparing a seasonal baseline to gradient boosting across the series' three structural phases makes the modeling choice the finding. Expanding windows respect temporal order; trees handle the categorical-heavy features without one-hot explosions.</w:t>
+        <w:t>Classification: predict the EV-versus-gasoline flag from brand, brand country, body type, and price band, since every model-month carries the label; tree ensembles suit the mixed features, and the exercise measures how predictable the transition was. Regression: predict monthly EV units from lagged sales and segment mix with expanding-window splits (no leakage); comparing a seasonal baseline to gradient boosting across the series' three structural phases makes the modeling choice the finding. Expanding windows respect temporal order; trees handle the categorical-heavy features without one-hot explosions.</w:t>
       </w:r>
     </w:p>
     <w:p>
@@ -847,7 +847,7 @@
     </w:p>
     <w:p>
       <w:r>
-        <w:t>Classification: predict popularity tier (or genre, post-dedupe) from audio features — which sonic attributes the market rewards. Clustering: group tracks into data-derived archetypes (e.g., high-energy/low-acousticness) for playlist and recommendation design, where the problem is matching songs to moods, not predicting one number. The audio features are dense and continuous — exactly the geometry clustering exploits.</w:t>
+        <w:t>Classification: predict popularity tier (or genre, post-dedupe) from audio features, which sonic attributes the market rewards. Clustering: group tracks into data-derived archetypes (e.g., high-energy/low-acousticness) for playlist and recommendation design, where the problem is matching songs to moods, not predicting one number. The audio features are dense and continuous, exactly the geometry clustering exploits.</w:t>
       </w:r>
     </w:p>
     <w:p>
@@ -861,7 +861,7 @@
     </w:p>
     <w:p>
       <w:r>
-        <w:t>Regression: predict log box-office revenue from budget, genre, cast/crew, timing, and pre-release popularity — the studio greenlight problem. Classification: hit vs flop (revenue &gt; 2× budget) from pre-release features only, evaluated with precision-recall for the asymmetric cost of a false greenlight. The log transform tames revenue's skew for linear models; trees capture the budget-genre interactions studios argue about.</w:t>
+        <w:t>Regression: predict log box-office revenue from budget, genre, cast/crew, timing, and pre-release popularity, the studio greenlight problem. Classification: hit vs flop (revenue &gt; 2× budget) from pre-release features only, evaluated with precision-recall for the asymmetric cost of a false greenlight. The log transform tames revenue's skew for linear models; trees capture the budget-genre interactions studios argue about.</w:t>
       </w:r>
     </w:p>
     <w:p>
@@ -880,7 +880,7 @@
         <w:rPr>
           <w:sz w:val="24"/>
         </w:rPr>
-        <w:t>Classification: predict the beat-the-market binary from short-interest features (short-to-volume ratio, days-to-cover, change in shorting) plus momentum controls — a clean test of whether short sellers are informed, with a balanced 47% positive rate. Regression: predict the next-month return; the literature suggests a weak negative coefficient on short interest, making feature-importance analysis the deliverable. Panel structure demands grouped evaluation: split by settlement date, never shuffle rows, so no future information leaks into training.</w:t>
+        <w:t>Classification: predict the beat-the-market binary from short-interest features (short-to-volume ratio, days-to-cover, change in shorting) plus momentum controls, a clean test of whether short sellers are informed, with a balanced 47% positive rate. Regression: predict the next-month return; the literature suggests a weak negative coefficient on short interest, making feature-importance analysis the deliverable. Panel structure demands grouped evaluation: split by settlement date, never shuffle rows, so no future information leaks into training.</w:t>
       </w:r>
     </w:p>
     <w:p>
@@ -898,12 +898,12 @@
           <w:b/>
           <w:sz w:val="24"/>
         </w:rPr>
-        <w:t>Dataset 1: SPY Equity Options Chain Snapshot (Finance — derivatives)</w:t>
+        <w:t>Dataset 1: SPY Equity Options Chain Snapshot (Finance: derivatives)</w:t>
       </w:r>
     </w:p>
     <w:p>
       <w:r>
-        <w:t>Can ML recover the volatility smile — predicting IV from moneyness and expiry? Matters to volatility trading and market-making; personally, an empirical test of the constant-volatility assumption in my Black-Scholes coursework. Do market Greeks behave as textbooks say across moneyness and tenor? I verified each behavior empirically here — useful for risk management and interview prep, and a check on the data's consistency. What drives IV most — moneyness, expiry, or liquidity? Tells pricing/risk functions where modeling effort belongs.</w:t>
+        <w:t>Can ML recover the volatility smile, predicting IV from moneyness and expiry? Matters to volatility trading and market-making; personally, an empirical test of the constant-volatility assumption in my Black-Scholes coursework. Do market Greeks behave as textbooks say across moneyness and tenor? I verified each behavior empirically here: useful for risk management and interview prep, and a check on the data's consistency. What drives IV most: moneyness, expiry, or liquidity? Tells pricing/risk functions where modeling effort belongs.</w:t>
       </w:r>
     </w:p>
     <w:p>
@@ -912,12 +912,12 @@
           <w:b/>
           <w:sz w:val="24"/>
         </w:rPr>
-        <w:t>Dataset 2: China Passenger-Vehicle Sales, CPCA (Environment — automotive)</w:t>
+        <w:t>Dataset 2: China Passenger-Vehicle Sales, CPCA (Environment: automotive)</w:t>
       </w:r>
     </w:p>
     <w:p>
       <w:r>
-        <w:t>Which attributes best predicted electrification — price segment, body type, or brand origin? Matters to auto strategy; personally, the demand side of emissions. Did the January 2023 subsidy end change EV price elasticity? A natural policy experiment in official-registration data. Can monthly EV sales be forecast from lags and mix, and where does a seasonal baseline break in 2021–2022? Matters to inventory and battery-supply planning.</w:t>
+        <w:t>Which attributes best predicted electrification: price segment, body type, or brand origin? Matters to auto strategy; personally, the demand side of emissions. Did the January 2023 subsidy end change EV price elasticity? A natural policy experiment in official-registration data. Can monthly EV sales be forecast from lags and mix, and where does a seasonal baseline break in 2021–2022? Matters to inventory and battery-supply planning.</w:t>
       </w:r>
     </w:p>
     <w:p>
@@ -926,12 +926,12 @@
           <w:b/>
           <w:sz w:val="24"/>
         </w:rPr>
-        <w:t>Dataset 3: Spotify Track Features (Entertainment — music)</w:t>
+        <w:t>Dataset 3: Spotify Track Features (Entertainment: music)</w:t>
       </w:r>
     </w:p>
     <w:p>
       <w:r>
-        <w:t>Which audio features predict popularity — energy, danceability, valence? Matters to streaming economics and A&amp;R; personally, a listener's curiosity. Do features cluster into stable archetypes for playlist design? Matters to recommendation, where the task is matching songs to moods.</w:t>
+        <w:t>Which audio features predict popularity: energy, danceability, valence? Matters to streaming economics and A&amp;R; personally, a listener's curiosity. Do features cluster into stable archetypes for playlist design? Matters to recommendation, where the task is matching songs to moods.</w:t>
       </w:r>
     </w:p>
     <w:p>
@@ -940,12 +940,12 @@
           <w:b/>
           <w:sz w:val="24"/>
         </w:rPr>
-        <w:t>Dataset 4: TMDB Movie Metadata (Entertainment — film)</w:t>
+        <w:t>Dataset 4: TMDB Movie Metadata (Entertainment: film)</w:t>
       </w:r>
     </w:p>
     <w:p>
       <w:r>
-        <w:t>What drives revenue — budget, genre, cast, timing, pre-release popularity? Matters to greenlighting; personally, what the market pays for as a film consumer. Can a pre-release hit/flop classifier flag failures before money is spent? Matters to risk management where one flop erases a slate.</w:t>
+        <w:t>What drives revenue: budget, genre, cast, timing, pre-release popularity? Matters to greenlighting; personally, what the market pays for as a film consumer. Can a pre-release hit/flop classifier flag failures before money is spent? Matters to risk management where one flop erases a slate.</w:t>
       </w:r>
     </w:p>
     <w:p>
@@ -955,7 +955,7 @@
           <w:b/>
           <w:sz w:val="24"/>
         </w:rPr>
-        <w:t>Dataset 5: FINRA Short Interest × S&amp;P 500 Panel (Finance — equities)</w:t>
+        <w:t>Dataset 5: FINRA Short Interest × S&amp;P 500 Panel (Finance: equities)</w:t>
       </w:r>
     </w:p>
     <w:p>
@@ -964,7 +964,7 @@
         <w:rPr>
           <w:sz w:val="24"/>
         </w:rPr>
-        <w:t>Are short sellers informed — does heavy shorting today predict underperformance next month? Directly testable against decades of academic debate, and personally the most market-relevant of my five datasets: it turns a regulatory disclosure into a trading question. Which matters more, the level of shorting or its change? That separates crowded shorts from fresh conviction.</w:t>
+        <w:t>Are short sellers informed: does heavy shorting today predict underperformance next month? Directly testable against decades of academic debate, and personally the most market-relevant of my five datasets: it turns a regulatory disclosure into a trading question. Which matters more, the level of shorting or its change? That separates crowded shorts from fresh conviction.</w:t>
       </w:r>
     </w:p>
     <w:p>
@@ -1027,7 +1027,7 @@
           <w:b/>
           <w:sz w:val="28"/>
         </w:rPr>
-        <w:t>Appendix B: Reflection — Weekly Capstone Development Reflection Journal</w:t>
+        <w:t>Appendix B: Reflection: Weekly Capstone Development Reflection Journal</w:t>
       </w:r>
     </w:p>
     <w:p>
@@ -1084,7 +1084,7 @@
     </w:p>
     <w:p>
       <w:r>
-        <w:t>Assignment/Capstone work: For each dataset I specified 1–2 machine learning types with justification — regression (SPY IV, TMDB revenue, Yahoo next-day return), classification (China EV flag, Spotify popularity, Yahoo direction), clustering (Spotify archetypes) — plus 2–3 research questions per dataset checked against the rubric.</w:t>
+        <w:t>Assignment/Capstone work: For each dataset I specified 1–2 machine learning types with justification, regression (SPY IV, TMDB revenue, Yahoo next-day return), classification (China EV flag, Spotify popularity, Yahoo direction), clustering (Spotify archetypes), plus 2–3 research questions per dataset checked against the rubric.</w:t>
       </w:r>
     </w:p>
     <w:p>
@@ -1107,12 +1107,12 @@
         <w:rPr>
           <w:sz w:val="24"/>
         </w:rPr>
-        <w:t>Assignment/Capstone work: I finalized the five datasets: SPY options (finance), China EV sales (environment), Spotify tracks and TMDB movies (entertainment), and a FINRA short-interest panel joined with Yahoo Finance prices (finance) for the fifth slot. With Kaggle unreachable from my machine, Spotify and TMDB were sourced from their Kaggle-published originals via local copies. Confirmed: three industries, mixed types, two-plus learning types, genuine data-quality problems in four of five.</w:t>
+        <w:t>Assignment/Capstone work: I finalized the five datasets: SPY options (finance), China EV sales (environment), Spotify tracks and TMDB movies (entertainment), and a FINRA short-interest panel joined with Yahoo Finance prices (finance) for the fifth slot. With Kaggle unreachable from my machine, Spotify and TMDB were sourced from their Kaggle-published originals via local copies. Confirmed: three industries, mixed types, two-plus learning types, data-quality problems in four of five.</w:t>
       </w:r>
     </w:p>
     <w:p>
       <w:r>
-        <w:t>Reflection: Dataset selection is mostly subtraction. Letting go of the CO2 panel hurt — the data was beautiful — but the rubric rewards fit over volume: five datasets I can defend beat eight I cannot.</w:t>
+        <w:t>Reflection: Dataset selection is mostly subtraction. Letting go of the CO2 panel hurt (the data was beautiful), but the rubric rewards fit over volume: five datasets I can defend beat eight I cannot.</w:t>
       </w:r>
     </w:p>
     <w:p>
@@ -1126,7 +1126,7 @@
     </w:p>
     <w:p>
       <w:r>
-        <w:t>Assignment/Capstone work: I audited the three new datasets — 450 duplicate rows and 24,259 duplicate track ids (label noise) in Spotify; 17 duplicates and zero-coded budgets in TMDB; a 97-ticker panel with no missing cells from Yahoo — and restructured the paper per-section with the rubric's exact labels, double spacing, and one page of examples.</w:t>
+        <w:t>Assignment/Capstone work: I audited the three new datasets, 450 duplicate rows and 24,259 duplicate track ids (label noise) in Spotify; 17 duplicates and zero-coded budgets in TMDB; a 97-ticker panel with no missing cells from Yahoo, and restructured the paper per-section with the rubric's exact labels, double spacing, and one page of examples.</w:t>
       </w:r>
     </w:p>
     <w:p>
@@ -1154,7 +1154,7 @@
         <w:rPr>
           <w:b/>
         </w:rPr>
-        <w:t>Dataset 1 — SPY options chain snapshot, near-the-money contracts (7 of 23 columns)</w:t>
+        <w:t>Dataset 1: SPY options chain snapshot, near-the-money contracts (7 of 23 columns)</w:t>
       </w:r>
     </w:p>
     <w:tbl>
@@ -1615,7 +1615,7 @@
         <w:rPr>
           <w:b/>
         </w:rPr>
-        <w:t>Dataset 2 — China passenger-vehicle sales (5 of 10 columns)</w:t>
+        <w:t>Dataset 2: China passenger-vehicle sales (5 of 10 columns)</w:t>
       </w:r>
     </w:p>
     <w:tbl>
@@ -2012,7 +2012,7 @@
         <w:rPr>
           <w:b/>
         </w:rPr>
-        <w:t>Dataset 3 — Spotify track features (7 of 20 columns)</w:t>
+        <w:t>Dataset 3: Spotify track features (7 of 20 columns)</w:t>
       </w:r>
     </w:p>
     <w:tbl>
@@ -2557,7 +2557,7 @@
         <w:rPr>
           <w:b/>
         </w:rPr>
-        <w:t>Dataset 4 — TMDB movie metadata (6 of 24 columns)</w:t>
+        <w:t>Dataset 4: TMDB movie metadata (6 of 24 columns)</w:t>
       </w:r>
     </w:p>
     <w:tbl>
@@ -3030,7 +3030,7 @@
           <w:b/>
           <w:sz w:val="24"/>
         </w:rPr>
-        <w:t>Dataset 5 — FINRA short interest × S&amp;P 500 panel (8 of 21 columns)</w:t>
+        <w:t>Dataset 5: FINRA short interest × S&amp;P 500 panel (8 of 21 columns)</w:t>
       </w:r>
     </w:p>
     <w:tbl>

</xml_diff>